<commit_message>
Report challenge 1 sicurezza
</commit_message>
<xml_diff>
--- a/2024-2025/Sicurezza/Esercitazioni/Esercitazione 1/report challenge1.docx
+++ b/2024-2025/Sicurezza/Esercitazioni/Esercitazione 1/report challenge1.docx
@@ -3,22 +3,499 @@
 <w:document xmlns:wpc="http://schemas.microsoft.com/office/word/2010/wordprocessingCanvas" xmlns:mc="http://schemas.openxmlformats.org/markup-compatibility/2006" xmlns:o="urn:schemas-microsoft-com:office:office" xmlns:r="http://schemas.openxmlformats.org/officeDocument/2006/relationships" xmlns:m="http://schemas.openxmlformats.org/officeDocument/2006/math" xmlns:v="urn:schemas-microsoft-com:vml" xmlns:wp14="http://schemas.microsoft.com/office/word/2010/wordprocessingDrawing" xmlns:wp="http://schemas.openxmlformats.org/drawingml/2006/wordprocessingDrawing" xmlns:w10="urn:schemas-microsoft-com:office:word" xmlns:w="http://schemas.openxmlformats.org/wordprocessingml/2006/main" xmlns:w14="http://schemas.microsoft.com/office/word/2010/wordml" xmlns:wpg="http://schemas.microsoft.com/office/word/2010/wordprocessingGroup" xmlns:wpi="http://schemas.microsoft.com/office/word/2010/wordprocessingInk" xmlns:wne="http://schemas.microsoft.com/office/word/2006/wordml" xmlns:wps="http://schemas.microsoft.com/office/word/2010/wordprocessingShape" mc:Ignorable="w14 wp14">
   <w:body>
     <w:p>
-      <w:r>
-        <w:t>Buo</w:t>
-      </w:r>
-      <w:bookmarkStart w:id="0" w:name="_GoBack"/>
+      <w:pPr>
+        <w:pStyle w:val="Titolo1"/>
+        <w:jc w:val="center"/>
+      </w:pPr>
+      <w:bookmarkStart w:id="0" w:name="_Toc179541022"/>
+      <w:r>
+        <w:t>REPORT CHALLENGE 1</w:t>
+      </w:r>
       <w:bookmarkEnd w:id="0"/>
-      <w:r>
-        <w:t xml:space="preserve">ngiorno a tutti, scusate il disturbo ma vi volevo inviare il report della prima </w:t>
-      </w:r>
-      <w:proofErr w:type="spellStart"/>
-      <w:r>
-        <w:t>challenge</w:t>
-      </w:r>
-      <w:proofErr w:type="spellEnd"/>
-      <w:r>
-        <w:t xml:space="preserve"> di sicurezza.</w:t>
-      </w:r>
+    </w:p>
+    <w:sdt>
+      <w:sdtPr>
+        <w:id w:val="-1182503070"/>
+        <w:docPartObj>
+          <w:docPartGallery w:val="Table of Contents"/>
+          <w:docPartUnique/>
+        </w:docPartObj>
+      </w:sdtPr>
+      <w:sdtEndPr>
+        <w:rPr>
+          <w:rFonts w:asciiTheme="minorHAnsi" w:eastAsiaTheme="minorHAnsi" w:hAnsiTheme="minorHAnsi" w:cstheme="minorBidi"/>
+          <w:color w:val="auto"/>
+          <w:sz w:val="22"/>
+          <w:szCs w:val="22"/>
+          <w:lang w:eastAsia="en-US"/>
+        </w:rPr>
+      </w:sdtEndPr>
+      <w:sdtContent>
+        <w:p>
+          <w:pPr>
+            <w:pStyle w:val="Titolosommario"/>
+          </w:pPr>
+          <w:r>
+            <w:t>Sommario</w:t>
+          </w:r>
+        </w:p>
+        <w:p>
+          <w:pPr>
+            <w:pStyle w:val="Sommario1"/>
+            <w:tabs>
+              <w:tab w:val="right" w:leader="dot" w:pos="9628"/>
+            </w:tabs>
+            <w:rPr>
+              <w:noProof/>
+            </w:rPr>
+          </w:pPr>
+          <w:r>
+            <w:fldChar w:fldCharType="begin"/>
+          </w:r>
+          <w:r>
+            <w:instrText xml:space="preserve"> TOC \o "1-3" \h \z \u </w:instrText>
+          </w:r>
+          <w:r>
+            <w:fldChar w:fldCharType="separate"/>
+          </w:r>
+          <w:hyperlink w:anchor="_Toc179541022" w:history="1">
+            <w:r>
+              <w:rPr>
+                <w:rStyle w:val="Collegamentoipertestuale"/>
+                <w:noProof/>
+              </w:rPr>
+              <w:t>REPORT CHALLENGE 1</w:t>
+            </w:r>
+            <w:r>
+              <w:rPr>
+                <w:noProof/>
+                <w:webHidden/>
+              </w:rPr>
+              <w:tab/>
+            </w:r>
+            <w:r>
+              <w:rPr>
+                <w:noProof/>
+                <w:webHidden/>
+              </w:rPr>
+              <w:fldChar w:fldCharType="begin"/>
+            </w:r>
+            <w:r>
+              <w:rPr>
+                <w:noProof/>
+                <w:webHidden/>
+              </w:rPr>
+              <w:instrText xml:space="preserve"> PAGEREF _Toc179541022 \h </w:instrText>
+            </w:r>
+            <w:r>
+              <w:rPr>
+                <w:noProof/>
+                <w:webHidden/>
+              </w:rPr>
+            </w:r>
+            <w:r>
+              <w:rPr>
+                <w:noProof/>
+                <w:webHidden/>
+              </w:rPr>
+              <w:fldChar w:fldCharType="separate"/>
+            </w:r>
+            <w:r>
+              <w:rPr>
+                <w:noProof/>
+                <w:webHidden/>
+              </w:rPr>
+              <w:t>1</w:t>
+            </w:r>
+            <w:r>
+              <w:rPr>
+                <w:noProof/>
+                <w:webHidden/>
+              </w:rPr>
+              <w:fldChar w:fldCharType="end"/>
+            </w:r>
+          </w:hyperlink>
+        </w:p>
+        <w:p>
+          <w:pPr>
+            <w:pStyle w:val="Sommario2"/>
+            <w:tabs>
+              <w:tab w:val="right" w:leader="dot" w:pos="9628"/>
+            </w:tabs>
+            <w:rPr>
+              <w:noProof/>
+            </w:rPr>
+          </w:pPr>
+          <w:hyperlink w:anchor="_Toc179541023" w:history="1">
+            <w:r>
+              <w:rPr>
+                <w:rStyle w:val="Collegamentoipertestuale"/>
+                <w:noProof/>
+              </w:rPr>
+              <w:t>POSIZIONAMENTO NELLA DIRECOTY E AVVIAMENTO GDB PASSWORD</w:t>
+            </w:r>
+            <w:r>
+              <w:rPr>
+                <w:noProof/>
+                <w:webHidden/>
+              </w:rPr>
+              <w:tab/>
+            </w:r>
+            <w:r>
+              <w:rPr>
+                <w:noProof/>
+                <w:webHidden/>
+              </w:rPr>
+              <w:fldChar w:fldCharType="begin"/>
+            </w:r>
+            <w:r>
+              <w:rPr>
+                <w:noProof/>
+                <w:webHidden/>
+              </w:rPr>
+              <w:instrText xml:space="preserve"> PAGEREF _Toc179541023 \h </w:instrText>
+            </w:r>
+            <w:r>
+              <w:rPr>
+                <w:noProof/>
+                <w:webHidden/>
+              </w:rPr>
+            </w:r>
+            <w:r>
+              <w:rPr>
+                <w:noProof/>
+                <w:webHidden/>
+              </w:rPr>
+              <w:fldChar w:fldCharType="separate"/>
+            </w:r>
+            <w:r>
+              <w:rPr>
+                <w:noProof/>
+                <w:webHidden/>
+              </w:rPr>
+              <w:t>2</w:t>
+            </w:r>
+            <w:r>
+              <w:rPr>
+                <w:noProof/>
+                <w:webHidden/>
+              </w:rPr>
+              <w:fldChar w:fldCharType="end"/>
+            </w:r>
+          </w:hyperlink>
+        </w:p>
+        <w:p>
+          <w:pPr>
+            <w:pStyle w:val="Sommario2"/>
+            <w:tabs>
+              <w:tab w:val="right" w:leader="dot" w:pos="9628"/>
+            </w:tabs>
+            <w:rPr>
+              <w:noProof/>
+            </w:rPr>
+          </w:pPr>
+          <w:hyperlink w:anchor="_Toc179541024" w:history="1">
+            <w:r>
+              <w:rPr>
+                <w:rStyle w:val="Collegamentoipertestuale"/>
+                <w:noProof/>
+              </w:rPr>
+              <w:t xml:space="preserve"> SET DISASSEMBLY INTEL E DISASS MAIN CON BREAKPOINT</w:t>
+            </w:r>
+            <w:r>
+              <w:rPr>
+                <w:noProof/>
+                <w:webHidden/>
+              </w:rPr>
+              <w:tab/>
+            </w:r>
+            <w:r>
+              <w:rPr>
+                <w:noProof/>
+                <w:webHidden/>
+              </w:rPr>
+              <w:fldChar w:fldCharType="begin"/>
+            </w:r>
+            <w:r>
+              <w:rPr>
+                <w:noProof/>
+                <w:webHidden/>
+              </w:rPr>
+              <w:instrText xml:space="preserve"> PAGEREF _Toc179541024 \h </w:instrText>
+            </w:r>
+            <w:r>
+              <w:rPr>
+                <w:noProof/>
+                <w:webHidden/>
+              </w:rPr>
+            </w:r>
+            <w:r>
+              <w:rPr>
+                <w:noProof/>
+                <w:webHidden/>
+              </w:rPr>
+              <w:fldChar w:fldCharType="separate"/>
+            </w:r>
+            <w:r>
+              <w:rPr>
+                <w:noProof/>
+                <w:webHidden/>
+              </w:rPr>
+              <w:t>2</w:t>
+            </w:r>
+            <w:r>
+              <w:rPr>
+                <w:noProof/>
+                <w:webHidden/>
+              </w:rPr>
+              <w:fldChar w:fldCharType="end"/>
+            </w:r>
+          </w:hyperlink>
+        </w:p>
+        <w:p>
+          <w:pPr>
+            <w:pStyle w:val="Sommario2"/>
+            <w:tabs>
+              <w:tab w:val="right" w:leader="dot" w:pos="9628"/>
+            </w:tabs>
+            <w:rPr>
+              <w:noProof/>
+            </w:rPr>
+          </w:pPr>
+          <w:hyperlink w:anchor="_Toc179541025" w:history="1">
+            <w:r>
+              <w:rPr>
+                <w:rStyle w:val="Collegamentoipertestuale"/>
+                <w:noProof/>
+              </w:rPr>
+              <w:t>CREAZIONE BREAKPOINT ALL’ISTRUZIONE DI INTERESSE</w:t>
+            </w:r>
+            <w:r>
+              <w:rPr>
+                <w:noProof/>
+                <w:webHidden/>
+              </w:rPr>
+              <w:tab/>
+            </w:r>
+            <w:r>
+              <w:rPr>
+                <w:noProof/>
+                <w:webHidden/>
+              </w:rPr>
+              <w:fldChar w:fldCharType="begin"/>
+            </w:r>
+            <w:r>
+              <w:rPr>
+                <w:noProof/>
+                <w:webHidden/>
+              </w:rPr>
+              <w:instrText xml:space="preserve"> PAGEREF _Toc179541025 \h </w:instrText>
+            </w:r>
+            <w:r>
+              <w:rPr>
+                <w:noProof/>
+                <w:webHidden/>
+              </w:rPr>
+            </w:r>
+            <w:r>
+              <w:rPr>
+                <w:noProof/>
+                <w:webHidden/>
+              </w:rPr>
+              <w:fldChar w:fldCharType="separate"/>
+            </w:r>
+            <w:r>
+              <w:rPr>
+                <w:noProof/>
+                <w:webHidden/>
+              </w:rPr>
+              <w:t>4</w:t>
+            </w:r>
+            <w:r>
+              <w:rPr>
+                <w:noProof/>
+                <w:webHidden/>
+              </w:rPr>
+              <w:fldChar w:fldCharType="end"/>
+            </w:r>
+          </w:hyperlink>
+        </w:p>
+        <w:p>
+          <w:pPr>
+            <w:pStyle w:val="Sommario2"/>
+            <w:tabs>
+              <w:tab w:val="right" w:leader="dot" w:pos="9628"/>
+            </w:tabs>
+            <w:rPr>
+              <w:noProof/>
+            </w:rPr>
+          </w:pPr>
+          <w:hyperlink w:anchor="_Toc179541026" w:history="1">
+            <w:r>
+              <w:rPr>
+                <w:rStyle w:val="Collegamentoipertestuale"/>
+                <w:noProof/>
+              </w:rPr>
+              <w:t>DEBUGGIN CODICE</w:t>
+            </w:r>
+            <w:r>
+              <w:rPr>
+                <w:noProof/>
+                <w:webHidden/>
+              </w:rPr>
+              <w:tab/>
+            </w:r>
+            <w:r>
+              <w:rPr>
+                <w:noProof/>
+                <w:webHidden/>
+              </w:rPr>
+              <w:fldChar w:fldCharType="begin"/>
+            </w:r>
+            <w:r>
+              <w:rPr>
+                <w:noProof/>
+                <w:webHidden/>
+              </w:rPr>
+              <w:instrText xml:space="preserve"> PAGEREF _Toc179541026 \h </w:instrText>
+            </w:r>
+            <w:r>
+              <w:rPr>
+                <w:noProof/>
+                <w:webHidden/>
+              </w:rPr>
+            </w:r>
+            <w:r>
+              <w:rPr>
+                <w:noProof/>
+                <w:webHidden/>
+              </w:rPr>
+              <w:fldChar w:fldCharType="separate"/>
+            </w:r>
+            <w:r>
+              <w:rPr>
+                <w:noProof/>
+                <w:webHidden/>
+              </w:rPr>
+              <w:t>4</w:t>
+            </w:r>
+            <w:r>
+              <w:rPr>
+                <w:noProof/>
+                <w:webHidden/>
+              </w:rPr>
+              <w:fldChar w:fldCharType="end"/>
+            </w:r>
+          </w:hyperlink>
+        </w:p>
+        <w:p>
+          <w:pPr>
+            <w:pStyle w:val="Sommario2"/>
+            <w:tabs>
+              <w:tab w:val="right" w:leader="dot" w:pos="9628"/>
+            </w:tabs>
+            <w:rPr>
+              <w:noProof/>
+            </w:rPr>
+          </w:pPr>
+          <w:hyperlink w:anchor="_Toc179541027" w:history="1">
+            <w:r>
+              <w:rPr>
+                <w:rStyle w:val="Collegamentoipertestuale"/>
+                <w:noProof/>
+              </w:rPr>
+              <w:t>ESECUZIONE DEL PROGRAMMA E CONTROLLO PASSWORD</w:t>
+            </w:r>
+            <w:r>
+              <w:rPr>
+                <w:noProof/>
+                <w:webHidden/>
+              </w:rPr>
+              <w:tab/>
+            </w:r>
+            <w:r>
+              <w:rPr>
+                <w:noProof/>
+                <w:webHidden/>
+              </w:rPr>
+              <w:fldChar w:fldCharType="begin"/>
+            </w:r>
+            <w:r>
+              <w:rPr>
+                <w:noProof/>
+                <w:webHidden/>
+              </w:rPr>
+              <w:instrText xml:space="preserve"> PAGEREF _Toc179541027 \h </w:instrText>
+            </w:r>
+            <w:r>
+              <w:rPr>
+                <w:noProof/>
+                <w:webHidden/>
+              </w:rPr>
+            </w:r>
+            <w:r>
+              <w:rPr>
+                <w:noProof/>
+                <w:webHidden/>
+              </w:rPr>
+              <w:fldChar w:fldCharType="separate"/>
+            </w:r>
+            <w:r>
+              <w:rPr>
+                <w:noProof/>
+                <w:webHidden/>
+              </w:rPr>
+              <w:t>7</w:t>
+            </w:r>
+            <w:r>
+              <w:rPr>
+                <w:noProof/>
+                <w:webHidden/>
+              </w:rPr>
+              <w:fldChar w:fldCharType="end"/>
+            </w:r>
+          </w:hyperlink>
+        </w:p>
+        <w:p>
+          <w:r>
+            <w:rPr>
+              <w:b/>
+              <w:bCs/>
+            </w:rPr>
+            <w:fldChar w:fldCharType="end"/>
+          </w:r>
+        </w:p>
+      </w:sdtContent>
+    </w:sdt>
+    <w:p/>
+    <w:p/>
+    <w:p/>
+    <w:p/>
+    <w:p/>
+    <w:p/>
+    <w:p/>
+    <w:p/>
+    <w:p/>
+    <w:p/>
+    <w:p/>
+    <w:p/>
+    <w:p/>
+    <w:p/>
+    <w:p/>
+    <w:p/>
+    <w:p/>
+    <w:p/>
+    <w:p/>
+    <w:p>
+      <w:pPr>
+        <w:pStyle w:val="Titolo2"/>
+      </w:pPr>
+      <w:bookmarkStart w:id="1" w:name="_Toc179541023"/>
+      <w:r>
+        <w:lastRenderedPageBreak/>
+        <w:t>POSIZIONAMENTO NELLA DIRECOTY E AVVIAMENTO GDB PASSWORD</w:t>
+      </w:r>
+      <w:bookmarkEnd w:id="1"/>
     </w:p>
     <w:p>
       <w:r>
@@ -34,19 +511,23 @@
       </w:r>
     </w:p>
     <w:p>
+      <w:pPr>
+        <w:pStyle w:val="Titolo2"/>
+      </w:pPr>
+      <w:bookmarkStart w:id="2" w:name="_Toc179541024"/>
       <w:r>
         <w:rPr>
           <w:noProof/>
           <w:lang w:eastAsia="it-IT"/>
         </w:rPr>
         <w:drawing>
-          <wp:anchor distT="0" distB="0" distL="114300" distR="114300" simplePos="0" relativeHeight="251658240" behindDoc="0" locked="0" layoutInCell="1" allowOverlap="1">
+          <wp:anchor distT="0" distB="0" distL="114300" distR="114300" simplePos="0" relativeHeight="251658240" behindDoc="0" locked="0" layoutInCell="1" allowOverlap="1" wp14:anchorId="5BC4A678" wp14:editId="223343BB">
             <wp:simplePos x="0" y="0"/>
             <wp:positionH relativeFrom="column">
-              <wp:align>left</wp:align>
+              <wp:posOffset>-81280</wp:posOffset>
             </wp:positionH>
             <wp:positionV relativeFrom="paragraph">
-              <wp:align>top</wp:align>
+              <wp:posOffset>18415</wp:posOffset>
             </wp:positionV>
             <wp:extent cx="6120130" cy="2478405"/>
             <wp:effectExtent l="0" t="0" r="0" b="0"/>
@@ -91,6 +572,14 @@
       </w:r>
       <w:r>
         <w:br w:type="textWrapping" w:clear="all"/>
+      </w:r>
+      <w:r>
+        <w:t>SET DISASSEMBLY INTEL E DISASS MAIN CON BREAKPOINT</w:t>
+      </w:r>
+      <w:bookmarkEnd w:id="2"/>
+    </w:p>
+    <w:p>
+      <w:r>
         <w:t xml:space="preserve">Successivamente ho eseguito set </w:t>
       </w:r>
       <w:proofErr w:type="spellStart"/>
@@ -139,7 +628,7 @@
           <w:lang w:eastAsia="it-IT"/>
         </w:rPr>
         <w:drawing>
-          <wp:inline distT="0" distB="0" distL="0" distR="0" wp14:anchorId="7E669369" wp14:editId="40322AEA">
+          <wp:inline distT="0" distB="0" distL="0" distR="0" wp14:anchorId="556D62FD" wp14:editId="607B5DBF">
             <wp:extent cx="3296110" cy="266737"/>
             <wp:effectExtent l="0" t="0" r="0" b="0"/>
             <wp:docPr id="2" name="Immagine 2"/>
@@ -275,6 +764,8 @@
     <w:p/>
     <w:p/>
     <w:p>
+      <w:bookmarkStart w:id="3" w:name="_GoBack"/>
+      <w:bookmarkEnd w:id="3"/>
       <w:r>
         <w:lastRenderedPageBreak/>
         <w:t xml:space="preserve">Nelle immagini che seguono si può vedere il </w:t>
@@ -419,7 +910,21 @@
         </w:drawing>
       </w:r>
     </w:p>
-    <w:p/>
+    <w:p>
+      <w:pPr>
+        <w:pStyle w:val="Titolo2"/>
+      </w:pPr>
+    </w:p>
+    <w:p>
+      <w:pPr>
+        <w:pStyle w:val="Titolo2"/>
+      </w:pPr>
+      <w:bookmarkStart w:id="4" w:name="_Toc179541025"/>
+      <w:r>
+        <w:t>CREAZIONE BREAKPOINT ALL’ISTRUZIONE DI INTERESSE</w:t>
+      </w:r>
+      <w:bookmarkEnd w:id="4"/>
+    </w:p>
     <w:p>
       <w:r>
         <w:t xml:space="preserve">A questo punto, dopo aver individuato la </w:t>
@@ -510,10 +1015,16 @@
       </w:r>
     </w:p>
     <w:p/>
-    <w:p/>
-    <w:p/>
-    <w:p/>
-    <w:p/>
+    <w:p>
+      <w:pPr>
+        <w:pStyle w:val="Titolo2"/>
+      </w:pPr>
+      <w:bookmarkStart w:id="5" w:name="_Toc179541026"/>
+      <w:r>
+        <w:t>DEBUGGIN CODICE</w:t>
+      </w:r>
+      <w:bookmarkEnd w:id="5"/>
+    </w:p>
     <w:p/>
     <w:p>
       <w:r>
@@ -561,39 +1072,51 @@
         <w:t xml:space="preserve"> e osservando </w:t>
       </w:r>
       <w:r>
-        <w:t xml:space="preserve"> se il registro </w:t>
+        <w:t xml:space="preserve"> se il registro della mia password cifrata ‘$</w:t>
+      </w:r>
+      <w:proofErr w:type="spellStart"/>
+      <w:r>
+        <w:t>rsi</w:t>
+      </w:r>
+      <w:proofErr w:type="spellEnd"/>
+      <w:r>
+        <w:t xml:space="preserve">’ </w:t>
+      </w:r>
+      <w:r>
+        <w:t>e</w:t>
+      </w:r>
+      <w:r>
+        <w:t xml:space="preserve"> quella della password corretta ‘$</w:t>
+      </w:r>
+      <w:proofErr w:type="spellStart"/>
+      <w:r>
+        <w:t>rdi</w:t>
+      </w:r>
+      <w:proofErr w:type="spellEnd"/>
+      <w:r>
+        <w:t>’</w:t>
+      </w:r>
+      <w:r>
+        <w:t xml:space="preserve"> contengono la stessa password</w:t>
+      </w:r>
+      <w:r>
+        <w:t>.</w:t>
+      </w:r>
+      <w:r>
+        <w:t xml:space="preserve"> Per trovare la password non cifrata sono partito inserendo una stringa di 8 caratteri e quando ho eseguito ho osservato il risultato cifrato e l’ho confrontato con il risultato atteso, dopodiché ho </w:t>
+      </w:r>
+      <w:r>
+        <w:t xml:space="preserve"> </w:t>
+      </w:r>
+      <w:r>
+        <w:t xml:space="preserve">calcolato la differenza dei valori ASCII tra la lettera che ho inserito e quella risultate dopo la cifratura. Fatto questo ho prima </w:t>
       </w:r>
       <w:r>
         <w:lastRenderedPageBreak/>
-        <w:t>della mia password cifrata ‘$</w:t>
-      </w:r>
-      <w:proofErr w:type="spellStart"/>
-      <w:r>
-        <w:t>rsi</w:t>
-      </w:r>
-      <w:proofErr w:type="spellEnd"/>
-      <w:r>
-        <w:t xml:space="preserve">’ </w:t>
-      </w:r>
-      <w:r>
-        <w:t>e</w:t>
-      </w:r>
-      <w:r>
-        <w:t xml:space="preserve"> quella della password corretta ‘$</w:t>
-      </w:r>
-      <w:proofErr w:type="spellStart"/>
-      <w:r>
-        <w:t>rdi</w:t>
-      </w:r>
-      <w:proofErr w:type="spellEnd"/>
-      <w:r>
-        <w:t>’</w:t>
-      </w:r>
-      <w:r>
-        <w:t xml:space="preserve"> contengono la stessa password</w:t>
-      </w:r>
-      <w:r>
-        <w:t xml:space="preserve">. Una volta trovato il fattore ci cifratura procedo a ripetere l’operazione di </w:t>
+        <w:t xml:space="preserve">sottratto il valore al codice ASCII della password corretta e in caso questa differenza risultasse errata provavo a eseguire la somma tra il valore della lettera e il calcolo della lettera cifrata e non. </w:t>
+      </w:r>
+      <w:r>
+        <w:t xml:space="preserve">Una volta trovato il fattore ci cifratura procedo a ripetere l’operazione di </w:t>
       </w:r>
       <w:proofErr w:type="spellStart"/>
       <w:r>
@@ -741,7 +1264,21 @@
         </w:drawing>
       </w:r>
     </w:p>
-    <w:p/>
+    <w:p>
+      <w:pPr>
+        <w:pStyle w:val="Titolo2"/>
+      </w:pPr>
+    </w:p>
+    <w:p>
+      <w:pPr>
+        <w:pStyle w:val="Titolo2"/>
+      </w:pPr>
+      <w:bookmarkStart w:id="6" w:name="_Toc179541027"/>
+      <w:r>
+        <w:t>ESECUZIONE DEL PROGRAMMA E CONTROLLO PASSWORD</w:t>
+      </w:r>
+      <w:bookmarkEnd w:id="6"/>
+    </w:p>
     <w:p>
       <w:r>
         <w:t xml:space="preserve">Una volta arrivato alla conclusione che la mia password non cifrata messa accanto al comando </w:t>
@@ -1053,6 +1590,53 @@
     <w:name w:val="Normal"/>
     <w:qFormat/>
   </w:style>
+  <w:style w:type="paragraph" w:styleId="Titolo1">
+    <w:name w:val="heading 1"/>
+    <w:basedOn w:val="Normale"/>
+    <w:next w:val="Normale"/>
+    <w:link w:val="Titolo1Carattere"/>
+    <w:uiPriority w:val="9"/>
+    <w:qFormat/>
+    <w:rsid w:val="00F245CB"/>
+    <w:pPr>
+      <w:keepNext/>
+      <w:keepLines/>
+      <w:spacing w:before="480" w:after="0"/>
+      <w:outlineLvl w:val="0"/>
+    </w:pPr>
+    <w:rPr>
+      <w:rFonts w:asciiTheme="majorHAnsi" w:eastAsiaTheme="majorEastAsia" w:hAnsiTheme="majorHAnsi" w:cstheme="majorBidi"/>
+      <w:b/>
+      <w:bCs/>
+      <w:color w:val="365F91" w:themeColor="accent1" w:themeShade="BF"/>
+      <w:sz w:val="28"/>
+      <w:szCs w:val="28"/>
+    </w:rPr>
+  </w:style>
+  <w:style w:type="paragraph" w:styleId="Titolo2">
+    <w:name w:val="heading 2"/>
+    <w:basedOn w:val="Normale"/>
+    <w:next w:val="Normale"/>
+    <w:link w:val="Titolo2Carattere"/>
+    <w:uiPriority w:val="9"/>
+    <w:unhideWhenUsed/>
+    <w:qFormat/>
+    <w:rsid w:val="007E67E5"/>
+    <w:pPr>
+      <w:keepNext/>
+      <w:keepLines/>
+      <w:spacing w:before="200" w:after="0"/>
+      <w:outlineLvl w:val="1"/>
+    </w:pPr>
+    <w:rPr>
+      <w:rFonts w:asciiTheme="majorHAnsi" w:eastAsiaTheme="majorEastAsia" w:hAnsiTheme="majorHAnsi" w:cstheme="majorBidi"/>
+      <w:b/>
+      <w:bCs/>
+      <w:color w:val="4F81BD" w:themeColor="accent1"/>
+      <w:sz w:val="26"/>
+      <w:szCs w:val="26"/>
+    </w:rPr>
+  </w:style>
   <w:style w:type="character" w:default="1" w:styleId="Carpredefinitoparagrafo">
     <w:name w:val="Default Paragraph Font"/>
     <w:uiPriority w:val="1"/>
@@ -1153,6 +1737,88 @@
     <w:link w:val="Pidipagina"/>
     <w:uiPriority w:val="99"/>
     <w:rsid w:val="00DF0F1A"/>
+  </w:style>
+  <w:style w:type="character" w:customStyle="1" w:styleId="Titolo1Carattere">
+    <w:name w:val="Titolo 1 Carattere"/>
+    <w:basedOn w:val="Carpredefinitoparagrafo"/>
+    <w:link w:val="Titolo1"/>
+    <w:uiPriority w:val="9"/>
+    <w:rsid w:val="00F245CB"/>
+    <w:rPr>
+      <w:rFonts w:asciiTheme="majorHAnsi" w:eastAsiaTheme="majorEastAsia" w:hAnsiTheme="majorHAnsi" w:cstheme="majorBidi"/>
+      <w:b/>
+      <w:bCs/>
+      <w:color w:val="365F91" w:themeColor="accent1" w:themeShade="BF"/>
+      <w:sz w:val="28"/>
+      <w:szCs w:val="28"/>
+    </w:rPr>
+  </w:style>
+  <w:style w:type="character" w:customStyle="1" w:styleId="Titolo2Carattere">
+    <w:name w:val="Titolo 2 Carattere"/>
+    <w:basedOn w:val="Carpredefinitoparagrafo"/>
+    <w:link w:val="Titolo2"/>
+    <w:uiPriority w:val="9"/>
+    <w:rsid w:val="007E67E5"/>
+    <w:rPr>
+      <w:rFonts w:asciiTheme="majorHAnsi" w:eastAsiaTheme="majorEastAsia" w:hAnsiTheme="majorHAnsi" w:cstheme="majorBidi"/>
+      <w:b/>
+      <w:bCs/>
+      <w:color w:val="4F81BD" w:themeColor="accent1"/>
+      <w:sz w:val="26"/>
+      <w:szCs w:val="26"/>
+    </w:rPr>
+  </w:style>
+  <w:style w:type="paragraph" w:styleId="Titolosommario">
+    <w:name w:val="TOC Heading"/>
+    <w:basedOn w:val="Titolo1"/>
+    <w:next w:val="Normale"/>
+    <w:uiPriority w:val="39"/>
+    <w:semiHidden/>
+    <w:unhideWhenUsed/>
+    <w:qFormat/>
+    <w:rsid w:val="004A0126"/>
+    <w:pPr>
+      <w:outlineLvl w:val="9"/>
+    </w:pPr>
+    <w:rPr>
+      <w:lang w:eastAsia="it-IT"/>
+    </w:rPr>
+  </w:style>
+  <w:style w:type="paragraph" w:styleId="Sommario1">
+    <w:name w:val="toc 1"/>
+    <w:basedOn w:val="Normale"/>
+    <w:next w:val="Normale"/>
+    <w:autoRedefine/>
+    <w:uiPriority w:val="39"/>
+    <w:unhideWhenUsed/>
+    <w:rsid w:val="004A0126"/>
+    <w:pPr>
+      <w:spacing w:after="100"/>
+    </w:pPr>
+  </w:style>
+  <w:style w:type="paragraph" w:styleId="Sommario2">
+    <w:name w:val="toc 2"/>
+    <w:basedOn w:val="Normale"/>
+    <w:next w:val="Normale"/>
+    <w:autoRedefine/>
+    <w:uiPriority w:val="39"/>
+    <w:unhideWhenUsed/>
+    <w:rsid w:val="004A0126"/>
+    <w:pPr>
+      <w:spacing w:after="100"/>
+      <w:ind w:left="220"/>
+    </w:pPr>
+  </w:style>
+  <w:style w:type="character" w:styleId="Collegamentoipertestuale">
+    <w:name w:val="Hyperlink"/>
+    <w:basedOn w:val="Carpredefinitoparagrafo"/>
+    <w:uiPriority w:val="99"/>
+    <w:unhideWhenUsed/>
+    <w:rsid w:val="004A0126"/>
+    <w:rPr>
+      <w:color w:val="0000FF" w:themeColor="hyperlink"/>
+      <w:u w:val="single"/>
+    </w:rPr>
   </w:style>
 </w:styles>
 </file>
@@ -1317,6 +1983,53 @@
     <w:name w:val="Normal"/>
     <w:qFormat/>
   </w:style>
+  <w:style w:type="paragraph" w:styleId="Titolo1">
+    <w:name w:val="heading 1"/>
+    <w:basedOn w:val="Normale"/>
+    <w:next w:val="Normale"/>
+    <w:link w:val="Titolo1Carattere"/>
+    <w:uiPriority w:val="9"/>
+    <w:qFormat/>
+    <w:rsid w:val="00F245CB"/>
+    <w:pPr>
+      <w:keepNext/>
+      <w:keepLines/>
+      <w:spacing w:before="480" w:after="0"/>
+      <w:outlineLvl w:val="0"/>
+    </w:pPr>
+    <w:rPr>
+      <w:rFonts w:asciiTheme="majorHAnsi" w:eastAsiaTheme="majorEastAsia" w:hAnsiTheme="majorHAnsi" w:cstheme="majorBidi"/>
+      <w:b/>
+      <w:bCs/>
+      <w:color w:val="365F91" w:themeColor="accent1" w:themeShade="BF"/>
+      <w:sz w:val="28"/>
+      <w:szCs w:val="28"/>
+    </w:rPr>
+  </w:style>
+  <w:style w:type="paragraph" w:styleId="Titolo2">
+    <w:name w:val="heading 2"/>
+    <w:basedOn w:val="Normale"/>
+    <w:next w:val="Normale"/>
+    <w:link w:val="Titolo2Carattere"/>
+    <w:uiPriority w:val="9"/>
+    <w:unhideWhenUsed/>
+    <w:qFormat/>
+    <w:rsid w:val="007E67E5"/>
+    <w:pPr>
+      <w:keepNext/>
+      <w:keepLines/>
+      <w:spacing w:before="200" w:after="0"/>
+      <w:outlineLvl w:val="1"/>
+    </w:pPr>
+    <w:rPr>
+      <w:rFonts w:asciiTheme="majorHAnsi" w:eastAsiaTheme="majorEastAsia" w:hAnsiTheme="majorHAnsi" w:cstheme="majorBidi"/>
+      <w:b/>
+      <w:bCs/>
+      <w:color w:val="4F81BD" w:themeColor="accent1"/>
+      <w:sz w:val="26"/>
+      <w:szCs w:val="26"/>
+    </w:rPr>
+  </w:style>
   <w:style w:type="character" w:default="1" w:styleId="Carpredefinitoparagrafo">
     <w:name w:val="Default Paragraph Font"/>
     <w:uiPriority w:val="1"/>
@@ -1417,6 +2130,88 @@
     <w:link w:val="Pidipagina"/>
     <w:uiPriority w:val="99"/>
     <w:rsid w:val="00DF0F1A"/>
+  </w:style>
+  <w:style w:type="character" w:customStyle="1" w:styleId="Titolo1Carattere">
+    <w:name w:val="Titolo 1 Carattere"/>
+    <w:basedOn w:val="Carpredefinitoparagrafo"/>
+    <w:link w:val="Titolo1"/>
+    <w:uiPriority w:val="9"/>
+    <w:rsid w:val="00F245CB"/>
+    <w:rPr>
+      <w:rFonts w:asciiTheme="majorHAnsi" w:eastAsiaTheme="majorEastAsia" w:hAnsiTheme="majorHAnsi" w:cstheme="majorBidi"/>
+      <w:b/>
+      <w:bCs/>
+      <w:color w:val="365F91" w:themeColor="accent1" w:themeShade="BF"/>
+      <w:sz w:val="28"/>
+      <w:szCs w:val="28"/>
+    </w:rPr>
+  </w:style>
+  <w:style w:type="character" w:customStyle="1" w:styleId="Titolo2Carattere">
+    <w:name w:val="Titolo 2 Carattere"/>
+    <w:basedOn w:val="Carpredefinitoparagrafo"/>
+    <w:link w:val="Titolo2"/>
+    <w:uiPriority w:val="9"/>
+    <w:rsid w:val="007E67E5"/>
+    <w:rPr>
+      <w:rFonts w:asciiTheme="majorHAnsi" w:eastAsiaTheme="majorEastAsia" w:hAnsiTheme="majorHAnsi" w:cstheme="majorBidi"/>
+      <w:b/>
+      <w:bCs/>
+      <w:color w:val="4F81BD" w:themeColor="accent1"/>
+      <w:sz w:val="26"/>
+      <w:szCs w:val="26"/>
+    </w:rPr>
+  </w:style>
+  <w:style w:type="paragraph" w:styleId="Titolosommario">
+    <w:name w:val="TOC Heading"/>
+    <w:basedOn w:val="Titolo1"/>
+    <w:next w:val="Normale"/>
+    <w:uiPriority w:val="39"/>
+    <w:semiHidden/>
+    <w:unhideWhenUsed/>
+    <w:qFormat/>
+    <w:rsid w:val="004A0126"/>
+    <w:pPr>
+      <w:outlineLvl w:val="9"/>
+    </w:pPr>
+    <w:rPr>
+      <w:lang w:eastAsia="it-IT"/>
+    </w:rPr>
+  </w:style>
+  <w:style w:type="paragraph" w:styleId="Sommario1">
+    <w:name w:val="toc 1"/>
+    <w:basedOn w:val="Normale"/>
+    <w:next w:val="Normale"/>
+    <w:autoRedefine/>
+    <w:uiPriority w:val="39"/>
+    <w:unhideWhenUsed/>
+    <w:rsid w:val="004A0126"/>
+    <w:pPr>
+      <w:spacing w:after="100"/>
+    </w:pPr>
+  </w:style>
+  <w:style w:type="paragraph" w:styleId="Sommario2">
+    <w:name w:val="toc 2"/>
+    <w:basedOn w:val="Normale"/>
+    <w:next w:val="Normale"/>
+    <w:autoRedefine/>
+    <w:uiPriority w:val="39"/>
+    <w:unhideWhenUsed/>
+    <w:rsid w:val="004A0126"/>
+    <w:pPr>
+      <w:spacing w:after="100"/>
+      <w:ind w:left="220"/>
+    </w:pPr>
+  </w:style>
+  <w:style w:type="character" w:styleId="Collegamentoipertestuale">
+    <w:name w:val="Hyperlink"/>
+    <w:basedOn w:val="Carpredefinitoparagrafo"/>
+    <w:uiPriority w:val="99"/>
+    <w:unhideWhenUsed/>
+    <w:rsid w:val="004A0126"/>
+    <w:rPr>
+      <w:color w:val="0000FF" w:themeColor="hyperlink"/>
+      <w:u w:val="single"/>
+    </w:rPr>
   </w:style>
 </w:styles>
 </file>
@@ -1711,7 +2506,7 @@
 </file>
 
 <file path=customXml/itemProps1.xml><?xml version="1.0" encoding="utf-8"?>
-<ds:datastoreItem xmlns:ds="http://schemas.openxmlformats.org/officeDocument/2006/customXml" ds:itemID="{921971A8-4F7F-4C2A-87CE-145677CE6FA1}">
+<ds:datastoreItem xmlns:ds="http://schemas.openxmlformats.org/officeDocument/2006/customXml" ds:itemID="{982345D7-0480-4A8E-A7A8-3C1B162E76FE}">
   <ds:schemaRefs>
     <ds:schemaRef ds:uri="http://schemas.openxmlformats.org/officeDocument/2006/bibliography"/>
   </ds:schemaRefs>

</xml_diff>